<commit_message>
docs: sync notes, slides, Gantt, figures and literature review for the Oct 20 meeting
- Project notes: four-stage chain, where things stand section by section,
  task-specific dataset table, October papers, distillation answer
- Slides moved into docs/notes/Slides; Oct 20 deck added
- Gantt workbook: research-plan add-ons slotted as IDs 17, 18, 24, 38,
  41, 42, 43
- Figures: paper figure scripts and the 21 Overleaf PDFs plus PNGs
  (project_logic, blf_pipeline, research_plan, task_coverage redrawn)
- Literature review: new Section 3.4 on fair comparison, alignment as a
  task, and multi-omics benchmarks; Works Cited extended
- sources.md: papers raised in October 2026
- Removed the stray all_figures copy and the meeting video from docs/notes

Co-Authored-By: Claude Fable 5.1 <noreply@anthropic.com>
Claude-Session: https://claude.ai/code/session_016iUz3FrBfCmdjUW7KcJVVN
</commit_message>
<xml_diff>
--- a/docs/Literature Review - Biological Foundation Models.docx
+++ b/docs/Literature Review - Biological Foundation Models.docx
@@ -939,6 +939,34 @@
     </w:p>
     <w:p>
       <w:pPr>
+        <w:pStyle w:val="Heading2"/>
+      </w:pPr>
+      <w:r>
+        <w:t xml:space="preserve">3.4 Recent Work on Fair Comparison, Alignment as a Task, and Multi-Omics Benchmarks</w:t>
+      </w:r>
+    </w:p>
+    <w:p>
+      <w:r>
+        <w:t xml:space="preserve">Four lines of recent work bear on how the fusion question should be posed. The first concerns evaluation. Rheude, Eils, and Wild reimplemented nineteen multimodal fusion methods on nine datasets with up to 23 modalities under standardized hyperparameter tuning, initialization, subject-wise cross-validation, and statistical testing, and found that no method held a consistent advantage over a simple baseline that projects each modality and reads the projections with a small transformer head; several methods were likely to fall below the best single modality (Rheude et al. 1–12). Their survey of the original publications found that only a minority reported error bars or cross-validation and none reported tuning or significance tests. Their datasets are not biological sequences, but the lesson transfers directly: a fusion result is credible only against a tuned single-modality baseline and a tuned simple-fusion baseline, with grouped cross-validation and a statistical comparison.</w:t>
+      </w:r>
+    </w:p>
+    <w:p>
+      <w:r>
+        <w:t xml:space="preserve">The second concerns alignment as an operational task rather than a similarity score. MSAlign learns small projections over a frozen mass-spectrum encoder and a frozen molecule encoder so that a spectrum retrieves its molecule from a candidate list, and introduces a measure of distribution shift between training and test splits that separates leakage from domain shift (Krzakala et al. 1–14). Its modalities differ from ours, but it shows alignment defined by a task that two representations must accomplish together, which is the standard our Stage 2 definition applies when it keeps representational agreement separate from predictive benefit. A different sense of the word appears in work that aligns a sequence model to a structure model of the same molecule: the structure-aligned protein language model adds contrastive alignment between a protein language model's residue states and a structure encoder, with large gains on fitness and contact prediction (Chen et al. 1–20), and OmniGenome aligns RNA sequences with their secondary structures bidirectionally, solving 74% of EternaV2 design puzzles against at most 3% for earlier foundation models (Yang, Chen, and Li 1–9). That is alignment between two views of one molecule, which the two-views-of-one-thing framing of Section 4.3 fits; alignment between encoders of different molecules linked by the central dogma is a separate question.</w:t>
+      </w:r>
+    </w:p>
+    <w:p>
+      <w:r>
+        <w:t xml:space="preserve">The third concerns benchmarks. mRNABench curates ten mature-mRNA datasets and 59 subtasks, including RNA half-life, translation efficiency, and mean ribosome load, places 45 nucleotide foundation models on them, and shows that random splits overestimate generalization when related sequences fall on both sides (mRNABench 1–20). COMET assembles seventeen tasks across DNA, RNA, protein, coding sequence, and pairs of molecules, including RNA-protein interaction, enhancer-promoter interaction, CRISPR off-target prediction, and DNA-protein folding, and evaluates single-omics language models, pairs of them, the jointly pretrained LucaOne, and the codon model CaLM; it finds that multi-molecule tasks remain difficult for every model tested (Ren et al. 1–25). These two benchmarks supply the tasks, splits, and published reference points for the Stage 4 question of which encoders to combine for which task, and COMET already reports the combinations of single-omics models that our encoder-swap experiments vary.</w:t>
+      </w:r>
+    </w:p>
+    <w:p>
+      <w:r>
+        <w:t xml:space="preserve">The fourth concerns generative multimodal modeling. MIMIC conditions a generative model across biomolecules and is evaluated on mRNABench tasks (Golkar et al. 1–30). It motivates the full-transcript tasks in our plan, but a generative model trained jointly is not evidence that fusing separately pretrained encoders will improve the same tasks, which is the question our Stage 4 tests.</w:t>
+      </w:r>
+    </w:p>
+    <w:p>
+      <w:pPr>
         <w:pStyle w:val="Heading1"/>
       </w:pPr>
       <w:r>
@@ -2685,6 +2713,15 @@
         <w:ind w:left="720" w:hanging="720"/>
       </w:pPr>
       <w:r>
+        <w:t xml:space="preserve">Chen, Can, et al. “Structure-Aligned Protein Language Model.” arXiv, version 2, 2025, https://arxiv.org/abs/2505.16896.</w:t>
+      </w:r>
+    </w:p>
+    <w:p>
+      <w:pPr>
+        <w:spacing w:after="100" w:line="240"/>
+        <w:ind w:left="720" w:hanging="720"/>
+      </w:pPr>
+      <w:r>
         <w:t xml:space="preserve">Chen, Jiayang, et al. “Interpretable RNA Foundation Model from Unannotated Data for Highly Accurate RNA Structure and Function Predictions.” </w:t>
       </w:r>
       <w:r>
@@ -2780,6 +2817,15 @@
         <w:ind w:left="720" w:hanging="720"/>
       </w:pPr>
       <w:r>
+        <w:t xml:space="preserve">Golkar, Siavash, et al. “MIMIC: A Generative Multimodal Foundation Model for Biomolecules.” arXiv, 2026, https://arxiv.org/abs/2604.24506.</w:t>
+      </w:r>
+    </w:p>
+    <w:p>
+      <w:pPr>
+        <w:spacing w:after="100" w:line="240"/>
+        <w:ind w:left="720" w:hanging="720"/>
+      </w:pPr>
+      <w:r>
         <w:t xml:space="preserve">GTEx Consortium. “The GTEx Consortium Atlas of Genetic Regulatory Effects across Human Tissues.” </w:t>
       </w:r>
       <w:r>
@@ -2894,6 +2940,15 @@
         <w:ind w:left="720" w:hanging="720"/>
       </w:pPr>
       <w:r>
+        <w:t xml:space="preserve">Krzakala, Paul, et al. “MSAlign: Aligning Molecule and Mass Spectra Representations for Metabolite Identification.” arXiv, version 2, 2026, https://arxiv.org/abs/2605.19752.</w:t>
+      </w:r>
+    </w:p>
+    <w:p>
+      <w:pPr>
+        <w:spacing w:after="100" w:line="240"/>
+        <w:ind w:left="720" w:hanging="720"/>
+      </w:pPr>
+      <w:r>
         <w:t xml:space="preserve">Li, Sizhen, et al. “CodonBERT Large Language Model for mRNA Vaccines.” </w:t>
       </w:r>
       <w:r>
@@ -2989,6 +3044,15 @@
         <w:ind w:left="720" w:hanging="720"/>
       </w:pPr>
       <w:r>
+        <w:t xml:space="preserve">“mRNABench: A Curated Benchmark for Mature mRNA Property and Function Prediction.” bioRxiv, 2025, https://doi.org/10.1101/2025.07.05.662870.</w:t>
+      </w:r>
+    </w:p>
+    <w:p>
+      <w:pPr>
+        <w:spacing w:after="100" w:line="240"/>
+        <w:ind w:left="720" w:hanging="720"/>
+      </w:pPr>
+      <w:r>
         <w:t xml:space="preserve">Nelson, David L., et al. </w:t>
       </w:r>
       <w:r>
@@ -3141,6 +3205,24 @@
         <w:ind w:left="720" w:hanging="720"/>
       </w:pPr>
       <w:r>
+        <w:t xml:space="preserve">Ren, Yuchen, et al. “COMET: Benchmark for Comprehensive Biological Multi-Omics Evaluation Tasks and Language Models.” arXiv, 2024, https://arxiv.org/abs/2412.10347.</w:t>
+      </w:r>
+    </w:p>
+    <w:p>
+      <w:pPr>
+        <w:spacing w:after="100" w:line="240"/>
+        <w:ind w:left="720" w:hanging="720"/>
+      </w:pPr>
+      <w:r>
+        <w:t xml:space="preserve">Rheude, Tillmann, Roland Eils, and Benjamin Wild. “Fusion or Confusion? Multimodal Complexity Is Not All You Need.” arXiv, version 3, 2026, https://arxiv.org/abs/2512.22991.</w:t>
+      </w:r>
+    </w:p>
+    <w:p>
+      <w:pPr>
+        <w:spacing w:after="100" w:line="240"/>
+        <w:ind w:left="720" w:hanging="720"/>
+      </w:pPr>
+      <w:r>
         <w:t xml:space="preserve">Tjandrasuwita, Megan, et al. “Understanding the Emergence of Multimodal Representation Alignment.” </w:t>
       </w:r>
       <w:r>
@@ -3171,6 +3253,15 @@
       </w:r>
       <w:r>
         <w:t xml:space="preserve">, vol. 30, 2017, pp. 5998–6008, https://proceedings.neurips.cc/paper/2017/hash/3f5ee243547dee91fbd053c1c4a845aa-Abstract.html.</w:t>
+      </w:r>
+    </w:p>
+    <w:p>
+      <w:pPr>
+        <w:spacing w:after="100" w:line="240"/>
+        <w:ind w:left="720" w:hanging="720"/>
+      </w:pPr>
+      <w:r>
+        <w:t xml:space="preserve">Yang, Heng, Renzhi Chen, and Ke Li. “Bridging Sequence-Structure Alignment in RNA Foundation Models.” Proceedings of the AAAI Conference on Artificial Intelligence, 2025, https://arxiv.org/abs/2407.11242.</w:t>
       </w:r>
     </w:p>
     <w:p>

</xml_diff>